<commit_message>
chore: snapshot workspace before parallel refactor
</commit_message>
<xml_diff>
--- a/An AI augmented author writing environment. .docx
+++ b/An AI augmented author writing environment. .docx
@@ -131,10 +131,12 @@
         <w:pStyle w:val="ListParagraph"/>
       </w:pPr>
       <w:proofErr w:type="spellStart"/>
+      <w:proofErr w:type="gramStart"/>
       <w:r>
         <w:t>lets</w:t>
       </w:r>
       <w:proofErr w:type="spellEnd"/>
+      <w:proofErr w:type="gramEnd"/>
       <w:r>
         <w:t xml:space="preserve"> the program automatically detect and mark major story moments throughout a manuscript, such as deaths, first encounters, character introductions, key interactions, and other important plot developments. The writer can also describe a specific event in plain language, and the AI will locate the matching passage in the manuscript and place a user-defined tag directly on </w:t>
       </w:r>
@@ -320,6 +322,19 @@
     <w:p/>
     <w:p>
       <w:pPr>
+        <w:rPr>
+          <w:rFonts w:asciiTheme="majorHAnsi" w:eastAsiaTheme="majorEastAsia" w:hAnsiTheme="majorHAnsi" w:cstheme="majorBidi"/>
+          <w:color w:val="0F4761" w:themeColor="accent1" w:themeShade="BF"/>
+          <w:sz w:val="32"/>
+          <w:szCs w:val="32"/>
+        </w:rPr>
+      </w:pPr>
+      <w:r>
+        <w:br w:type="page"/>
+      </w:r>
+    </w:p>
+    <w:p>
+      <w:pPr>
         <w:pStyle w:val="Heading2"/>
         <w:numPr>
           <w:ilvl w:val="0"/>
@@ -327,10 +342,334 @@
         </w:numPr>
       </w:pPr>
       <w:r>
+        <w:lastRenderedPageBreak/>
+        <w:t xml:space="preserve">A Writing Progress Tracker. </w:t>
+      </w:r>
+    </w:p>
+    <w:p>
+      <w:r>
+        <w:t xml:space="preserve">The user can track their writing progress days at a time to meet their writing goals and ensure that their progress is on track. </w:t>
+      </w:r>
+    </w:p>
+    <w:p>
+      <w:r>
+        <w:t xml:space="preserve">Eventually this tracker can also then be shared with fans in updates to show their audience that they are working on new content. </w:t>
+      </w:r>
+    </w:p>
+    <w:p>
+      <w:r>
+        <w:drawing>
+          <wp:anchor distT="0" distB="0" distL="114300" distR="114300" simplePos="0" relativeHeight="251659264" behindDoc="1" locked="0" layoutInCell="1" allowOverlap="1" wp14:anchorId="23EC4755" wp14:editId="4EC29DDD">
+            <wp:simplePos x="0" y="0"/>
+            <wp:positionH relativeFrom="column">
+              <wp:posOffset>265814</wp:posOffset>
+            </wp:positionH>
+            <wp:positionV relativeFrom="paragraph">
+              <wp:posOffset>4409189</wp:posOffset>
+            </wp:positionV>
+            <wp:extent cx="5731510" cy="3039745"/>
+            <wp:effectExtent l="0" t="0" r="2540" b="8255"/>
+            <wp:wrapTight wrapText="bothSides">
+              <wp:wrapPolygon edited="0">
+                <wp:start x="0" y="0"/>
+                <wp:lineTo x="0" y="21523"/>
+                <wp:lineTo x="21538" y="21523"/>
+                <wp:lineTo x="21538" y="0"/>
+                <wp:lineTo x="0" y="0"/>
+              </wp:wrapPolygon>
+            </wp:wrapTight>
+            <wp:docPr id="1064262449" name="Picture 1"/>
+            <wp:cNvGraphicFramePr>
+              <a:graphicFrameLocks xmlns:a="http://schemas.openxmlformats.org/drawingml/2006/main" noChangeAspect="1"/>
+            </wp:cNvGraphicFramePr>
+            <a:graphic xmlns:a="http://schemas.openxmlformats.org/drawingml/2006/main">
+              <a:graphicData uri="http://schemas.openxmlformats.org/drawingml/2006/picture">
+                <pic:pic xmlns:pic="http://schemas.openxmlformats.org/drawingml/2006/picture">
+                  <pic:nvPicPr>
+                    <pic:cNvPr id="1064262449" name=""/>
+                    <pic:cNvPicPr/>
+                  </pic:nvPicPr>
+                  <pic:blipFill>
+                    <a:blip r:embed="rId5">
+                      <a:extLst>
+                        <a:ext uri="{28A0092B-C50C-407E-A947-70E740481C1C}">
+                          <a14:useLocalDpi xmlns:a14="http://schemas.microsoft.com/office/drawing/2010/main" val="0"/>
+                        </a:ext>
+                      </a:extLst>
+                    </a:blip>
+                    <a:stretch>
+                      <a:fillRect/>
+                    </a:stretch>
+                  </pic:blipFill>
+                  <pic:spPr>
+                    <a:xfrm>
+                      <a:off x="0" y="0"/>
+                      <a:ext cx="5731510" cy="3039745"/>
+                    </a:xfrm>
+                    <a:prstGeom prst="rect">
+                      <a:avLst/>
+                    </a:prstGeom>
+                  </pic:spPr>
+                </pic:pic>
+              </a:graphicData>
+            </a:graphic>
+            <wp14:sizeRelH relativeFrom="page">
+              <wp14:pctWidth>0</wp14:pctWidth>
+            </wp14:sizeRelH>
+            <wp14:sizeRelV relativeFrom="page">
+              <wp14:pctHeight>0</wp14:pctHeight>
+            </wp14:sizeRelV>
+          </wp:anchor>
+        </w:drawing>
+      </w:r>
+      <w:r>
+        <w:t xml:space="preserve">There is also the thought that draft reviews should be able to be planned for her </w:t>
+      </w:r>
+      <w:proofErr w:type="spellStart"/>
+      <w:r>
+        <w:t>aswell</w:t>
+      </w:r>
+      <w:proofErr w:type="spellEnd"/>
+      <w:r>
+        <w:t xml:space="preserve">. But </w:t>
+      </w:r>
+      <w:proofErr w:type="gramStart"/>
+      <w:r>
+        <w:t>usually</w:t>
+      </w:r>
+      <w:proofErr w:type="gramEnd"/>
+      <w:r>
+        <w:t xml:space="preserve"> the first draft would be considered. The user writes the first </w:t>
+      </w:r>
+      <w:proofErr w:type="gramStart"/>
+      <w:r>
+        <w:t>draft</w:t>
+      </w:r>
+      <w:proofErr w:type="gramEnd"/>
+      <w:r>
+        <w:t xml:space="preserve"> and the environment should consider this aspect when the user is planning their book. </w:t>
+      </w:r>
+    </w:p>
+    <w:p>
+      <w:r>
+        <w:lastRenderedPageBreak/>
+        <w:drawing>
+          <wp:anchor distT="0" distB="0" distL="114300" distR="114300" simplePos="0" relativeHeight="251660288" behindDoc="1" locked="0" layoutInCell="1" allowOverlap="1" wp14:anchorId="115CCCA1" wp14:editId="5FA91867">
+            <wp:simplePos x="0" y="0"/>
+            <wp:positionH relativeFrom="margin">
+              <wp:align>right</wp:align>
+            </wp:positionH>
+            <wp:positionV relativeFrom="paragraph">
+              <wp:posOffset>4369981</wp:posOffset>
+            </wp:positionV>
+            <wp:extent cx="5731510" cy="4146550"/>
+            <wp:effectExtent l="0" t="0" r="2540" b="6350"/>
+            <wp:wrapTight wrapText="bothSides">
+              <wp:wrapPolygon edited="0">
+                <wp:start x="0" y="0"/>
+                <wp:lineTo x="0" y="21534"/>
+                <wp:lineTo x="21538" y="21534"/>
+                <wp:lineTo x="21538" y="0"/>
+                <wp:lineTo x="0" y="0"/>
+              </wp:wrapPolygon>
+            </wp:wrapTight>
+            <wp:docPr id="2101249371" name="Picture 1"/>
+            <wp:cNvGraphicFramePr>
+              <a:graphicFrameLocks xmlns:a="http://schemas.openxmlformats.org/drawingml/2006/main" noChangeAspect="1"/>
+            </wp:cNvGraphicFramePr>
+            <a:graphic xmlns:a="http://schemas.openxmlformats.org/drawingml/2006/main">
+              <a:graphicData uri="http://schemas.openxmlformats.org/drawingml/2006/picture">
+                <pic:pic xmlns:pic="http://schemas.openxmlformats.org/drawingml/2006/picture">
+                  <pic:nvPicPr>
+                    <pic:cNvPr id="2101249371" name=""/>
+                    <pic:cNvPicPr/>
+                  </pic:nvPicPr>
+                  <pic:blipFill>
+                    <a:blip r:embed="rId6">
+                      <a:extLst>
+                        <a:ext uri="{28A0092B-C50C-407E-A947-70E740481C1C}">
+                          <a14:useLocalDpi xmlns:a14="http://schemas.microsoft.com/office/drawing/2010/main" val="0"/>
+                        </a:ext>
+                      </a:extLst>
+                    </a:blip>
+                    <a:stretch>
+                      <a:fillRect/>
+                    </a:stretch>
+                  </pic:blipFill>
+                  <pic:spPr>
+                    <a:xfrm>
+                      <a:off x="0" y="0"/>
+                      <a:ext cx="5731510" cy="4146550"/>
+                    </a:xfrm>
+                    <a:prstGeom prst="rect">
+                      <a:avLst/>
+                    </a:prstGeom>
+                  </pic:spPr>
+                </pic:pic>
+              </a:graphicData>
+            </a:graphic>
+            <wp14:sizeRelH relativeFrom="page">
+              <wp14:pctWidth>0</wp14:pctWidth>
+            </wp14:sizeRelH>
+            <wp14:sizeRelV relativeFrom="page">
+              <wp14:pctHeight>0</wp14:pctHeight>
+            </wp14:sizeRelV>
+          </wp:anchor>
+        </w:drawing>
+      </w:r>
+      <w:r>
+        <w:drawing>
+          <wp:anchor distT="0" distB="0" distL="114300" distR="114300" simplePos="0" relativeHeight="251658240" behindDoc="1" locked="0" layoutInCell="1" allowOverlap="1" wp14:anchorId="1FCFC81F" wp14:editId="46BF7BF6">
+            <wp:simplePos x="0" y="0"/>
+            <wp:positionH relativeFrom="column">
+              <wp:posOffset>0</wp:posOffset>
+            </wp:positionH>
+            <wp:positionV relativeFrom="paragraph">
+              <wp:posOffset>-3116</wp:posOffset>
+            </wp:positionV>
+            <wp:extent cx="5731510" cy="4298315"/>
+            <wp:effectExtent l="0" t="0" r="2540" b="6985"/>
+            <wp:wrapTight wrapText="bothSides">
+              <wp:wrapPolygon edited="0">
+                <wp:start x="0" y="0"/>
+                <wp:lineTo x="0" y="21539"/>
+                <wp:lineTo x="21538" y="21539"/>
+                <wp:lineTo x="21538" y="0"/>
+                <wp:lineTo x="0" y="0"/>
+              </wp:wrapPolygon>
+            </wp:wrapTight>
+            <wp:docPr id="2112170385" name="Picture 1"/>
+            <wp:cNvGraphicFramePr>
+              <a:graphicFrameLocks xmlns:a="http://schemas.openxmlformats.org/drawingml/2006/main" noChangeAspect="1"/>
+            </wp:cNvGraphicFramePr>
+            <a:graphic xmlns:a="http://schemas.openxmlformats.org/drawingml/2006/main">
+              <a:graphicData uri="http://schemas.openxmlformats.org/drawingml/2006/picture">
+                <pic:pic xmlns:pic="http://schemas.openxmlformats.org/drawingml/2006/picture">
+                  <pic:nvPicPr>
+                    <pic:cNvPr id="2112170385" name=""/>
+                    <pic:cNvPicPr/>
+                  </pic:nvPicPr>
+                  <pic:blipFill>
+                    <a:blip r:embed="rId7">
+                      <a:extLst>
+                        <a:ext uri="{28A0092B-C50C-407E-A947-70E740481C1C}">
+                          <a14:useLocalDpi xmlns:a14="http://schemas.microsoft.com/office/drawing/2010/main" val="0"/>
+                        </a:ext>
+                      </a:extLst>
+                    </a:blip>
+                    <a:stretch>
+                      <a:fillRect/>
+                    </a:stretch>
+                  </pic:blipFill>
+                  <pic:spPr>
+                    <a:xfrm>
+                      <a:off x="0" y="0"/>
+                      <a:ext cx="5731510" cy="4298315"/>
+                    </a:xfrm>
+                    <a:prstGeom prst="rect">
+                      <a:avLst/>
+                    </a:prstGeom>
+                  </pic:spPr>
+                </pic:pic>
+              </a:graphicData>
+            </a:graphic>
+            <wp14:sizeRelH relativeFrom="page">
+              <wp14:pctWidth>0</wp14:pctWidth>
+            </wp14:sizeRelH>
+            <wp14:sizeRelV relativeFrom="page">
+              <wp14:pctHeight>0</wp14:pctHeight>
+            </wp14:sizeRelV>
+          </wp:anchor>
+        </w:drawing>
+      </w:r>
+    </w:p>
+    <w:p/>
+    <w:p>
+      <w:pPr>
+        <w:pStyle w:val="Heading2"/>
+        <w:numPr>
+          <w:ilvl w:val="0"/>
+          <w:numId w:val="2"/>
+        </w:numPr>
+      </w:pPr>
+      <w:r>
         <w:br w:type="page"/>
       </w:r>
     </w:p>
-    <w:p/>
+    <w:p>
+      <w:r>
+        <w:rPr>
+          <w:noProof/>
+        </w:rPr>
+        <w:lastRenderedPageBreak/>
+        <mc:AlternateContent>
+          <mc:Choice Requires="wps">
+            <w:drawing>
+              <wp:inline distT="0" distB="0" distL="0" distR="0" wp14:anchorId="4748A9DA" wp14:editId="7BBC90FD">
+                <wp:extent cx="308610" cy="308610"/>
+                <wp:effectExtent l="0" t="0" r="0" b="0"/>
+                <wp:docPr id="419886461" name="Rectangle 1"/>
+                <wp:cNvGraphicFramePr>
+                  <a:graphicFrameLocks xmlns:a="http://schemas.openxmlformats.org/drawingml/2006/main" noChangeAspect="1"/>
+                </wp:cNvGraphicFramePr>
+                <a:graphic xmlns:a="http://schemas.openxmlformats.org/drawingml/2006/main">
+                  <a:graphicData uri="http://schemas.microsoft.com/office/word/2010/wordprocessingShape">
+                    <wps:wsp>
+                      <wps:cNvSpPr>
+                        <a:spLocks noChangeAspect="1" noChangeArrowheads="1"/>
+                      </wps:cNvSpPr>
+                      <wps:spPr bwMode="auto">
+                        <a:xfrm>
+                          <a:off x="0" y="0"/>
+                          <a:ext cx="308610" cy="308610"/>
+                        </a:xfrm>
+                        <a:prstGeom prst="rect">
+                          <a:avLst/>
+                        </a:prstGeom>
+                        <a:noFill/>
+                        <a:ln>
+                          <a:noFill/>
+                        </a:ln>
+                        <a:extLst>
+                          <a:ext uri="{909E8E84-426E-40DD-AFC4-6F175D3DCCD1}">
+                            <a14:hiddenFill xmlns:a14="http://schemas.microsoft.com/office/drawing/2010/main">
+                              <a:solidFill>
+                                <a:srgbClr val="FFFFFF"/>
+                              </a:solidFill>
+                            </a14:hiddenFill>
+                          </a:ext>
+                          <a:ext uri="{91240B29-F687-4F45-9708-019B960494DF}">
+                            <a14:hiddenLine xmlns:a14="http://schemas.microsoft.com/office/drawing/2010/main" w="9525">
+                              <a:solidFill>
+                                <a:srgbClr val="000000"/>
+                              </a:solidFill>
+                              <a:miter lim="800000"/>
+                              <a:headEnd/>
+                              <a:tailEnd/>
+                            </a14:hiddenLine>
+                          </a:ext>
+                        </a:extLst>
+                      </wps:spPr>
+                      <wps:bodyPr rot="0" vert="horz" wrap="square" lIns="91440" tIns="45720" rIns="91440" bIns="45720" anchor="t" anchorCtr="0" upright="1">
+                        <a:noAutofit/>
+                      </wps:bodyPr>
+                    </wps:wsp>
+                  </a:graphicData>
+                </a:graphic>
+              </wp:inline>
+            </w:drawing>
+          </mc:Choice>
+          <mc:Fallback>
+            <w:pict>
+              <v:rect w14:anchorId="29F805F0" id="Rectangle 1" o:spid="_x0000_s1026" style="width:24.3pt;height:24.3pt;visibility:visible;mso-wrap-style:square;mso-left-percent:-10001;mso-top-percent:-10001;mso-position-horizontal:absolute;mso-position-horizontal-relative:char;mso-position-vertical:absolute;mso-position-vertical-relative:line;mso-left-percent:-10001;mso-top-percent:-10001;v-text-anchor:top" o:gfxdata="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" filled="f" stroked="f">
+                <o:lock v:ext="edit" aspectratio="t"/>
+                <w10:anchorlock/>
+              </v:rect>
+            </w:pict>
+          </mc:Fallback>
+        </mc:AlternateContent>
+      </w:r>
+    </w:p>
     <w:sectPr>
       <w:pgSz w:w="11906" w:h="16838"/>
       <w:pgMar w:top="1440" w:right="1440" w:bottom="1440" w:left="1440" w:header="708" w:footer="708" w:gutter="0"/>

</xml_diff>

<commit_message>
refactor: align editor shell and save pipeline
</commit_message>
<xml_diff>
--- a/An AI augmented author writing environment. .docx
+++ b/An AI augmented author writing environment. .docx
@@ -130,15 +130,8 @@
       <w:pPr>
         <w:pStyle w:val="ListParagraph"/>
       </w:pPr>
-      <w:proofErr w:type="spellStart"/>
-      <w:proofErr w:type="gramStart"/>
-      <w:r>
-        <w:t>lets</w:t>
-      </w:r>
-      <w:proofErr w:type="spellEnd"/>
-      <w:proofErr w:type="gramEnd"/>
-      <w:r>
-        <w:t xml:space="preserve"> the program automatically detect and mark major story moments throughout a manuscript, such as deaths, first encounters, character introductions, key interactions, and other important plot developments. The writer can also describe a specific event in plain language, and the AI will locate the matching passage in the manuscript and place a user-defined tag directly on </w:t>
+      <w:r>
+        <w:t xml:space="preserve">lets the program automatically detect and mark major story moments throughout a manuscript, such as deaths, first encounters, character introductions, key interactions, and other important plot developments. The writer can also describe a specific event in plain language, and the AI will locate the matching passage in the manuscript and place a user-defined tag directly on </w:t>
       </w:r>
       <w:r>
         <w:lastRenderedPageBreak/>
@@ -172,15 +165,7 @@
         <w:pStyle w:val="ListParagraph"/>
       </w:pPr>
       <w:r>
-        <w:t xml:space="preserve">is a live reading view that listens to the narrator’s voice, matches the spoken words against the manuscript in real time, and automatically keeps the current line or sentence </w:t>
-      </w:r>
-      <w:proofErr w:type="spellStart"/>
-      <w:r>
-        <w:t>centered</w:t>
-      </w:r>
-      <w:proofErr w:type="spellEnd"/>
-      <w:r>
-        <w:t xml:space="preserve"> on screen as the text scrolls smoothly ahead. Designed for audiobook recording, rehearsed narration, and long-form manuscript review, it reduces manual scrolling and page hunting, helping the reader stay locked onto the script with minimal interruption even if they pause, repeat a phrase, or momentarily lose their place.</w:t>
+        <w:t>is a live reading view that listens to the narrator’s voice, matches the spoken words against the manuscript in real time, and automatically keeps the current line or sentence centered on screen as the text scrolls smoothly ahead. Designed for audiobook recording, rehearsed narration, and long-form manuscript review, it reduces manual scrolling and page hunting, helping the reader stay locked onto the script with minimal interruption even if they pause, repeat a phrase, or momentarily lose their place.</w:t>
       </w:r>
     </w:p>
     <w:p>
@@ -319,6 +304,7 @@
         <w:t>Progress</w:t>
       </w:r>
     </w:p>
+    <w:p/>
     <w:p/>
     <w:p>
       <w:pPr>
@@ -358,6 +344,9 @@
     </w:p>
     <w:p>
       <w:r>
+        <w:rPr>
+          <w:noProof/>
+        </w:rPr>
         <w:drawing>
           <wp:anchor distT="0" distB="0" distL="114300" distR="114300" simplePos="0" relativeHeight="251659264" behindDoc="1" locked="0" layoutInCell="1" allowOverlap="1" wp14:anchorId="23EC4755" wp14:editId="4EC29DDD">
             <wp:simplePos x="0" y="0"/>
@@ -423,35 +412,14 @@
         </w:drawing>
       </w:r>
       <w:r>
-        <w:t xml:space="preserve">There is also the thought that draft reviews should be able to be planned for her </w:t>
-      </w:r>
-      <w:proofErr w:type="spellStart"/>
-      <w:r>
-        <w:t>aswell</w:t>
-      </w:r>
-      <w:proofErr w:type="spellEnd"/>
-      <w:r>
-        <w:t xml:space="preserve">. But </w:t>
-      </w:r>
-      <w:proofErr w:type="gramStart"/>
-      <w:r>
-        <w:t>usually</w:t>
-      </w:r>
-      <w:proofErr w:type="gramEnd"/>
-      <w:r>
-        <w:t xml:space="preserve"> the first draft would be considered. The user writes the first </w:t>
-      </w:r>
-      <w:proofErr w:type="gramStart"/>
-      <w:r>
-        <w:t>draft</w:t>
-      </w:r>
-      <w:proofErr w:type="gramEnd"/>
-      <w:r>
-        <w:t xml:space="preserve"> and the environment should consider this aspect when the user is planning their book. </w:t>
-      </w:r>
-    </w:p>
-    <w:p>
-      <w:r>
+        <w:t xml:space="preserve">There is also the thought that draft reviews should be able to be planned for her aswell. But usually the first draft would be considered. The user writes the first draft and the environment should consider this aspect when the user is planning their book. </w:t>
+      </w:r>
+    </w:p>
+    <w:p>
+      <w:r>
+        <w:rPr>
+          <w:noProof/>
+        </w:rPr>
         <w:lastRenderedPageBreak/>
         <w:drawing>
           <wp:anchor distT="0" distB="0" distL="114300" distR="114300" simplePos="0" relativeHeight="251660288" behindDoc="1" locked="0" layoutInCell="1" allowOverlap="1" wp14:anchorId="115CCCA1" wp14:editId="5FA91867">
@@ -518,6 +486,9 @@
         </w:drawing>
       </w:r>
       <w:r>
+        <w:rPr>
+          <w:noProof/>
+        </w:rPr>
         <w:drawing>
           <wp:anchor distT="0" distB="0" distL="114300" distR="114300" simplePos="0" relativeHeight="251658240" behindDoc="1" locked="0" layoutInCell="1" allowOverlap="1" wp14:anchorId="1FCFC81F" wp14:editId="46BF7BF6">
             <wp:simplePos x="0" y="0"/>
@@ -586,6 +557,122 @@
     <w:p/>
     <w:p>
       <w:pPr>
+        <w:pStyle w:val="Heading3"/>
+      </w:pPr>
+      <w:r>
+        <w:t xml:space="preserve">Session Tracker Logic. </w:t>
+      </w:r>
+    </w:p>
+    <w:p>
+      <w:r>
+        <w:t xml:space="preserve">Session Tracker Logic, </w:t>
+      </w:r>
+    </w:p>
+    <w:p>
+      <w:r>
+        <w:t xml:space="preserve">1. There are default settings that are stored within the project save file for each project. These settings are as follows, and can be edited in the writing goals panel by the user for the current loaded project. </w:t>
+      </w:r>
+    </w:p>
+    <w:p>
+      <w:pPr>
+        <w:pStyle w:val="ListParagraph"/>
+        <w:numPr>
+          <w:ilvl w:val="0"/>
+          <w:numId w:val="12"/>
+        </w:numPr>
+      </w:pPr>
+      <w:r>
+        <w:t>Idle Time: 5 minutes</w:t>
+      </w:r>
+    </w:p>
+    <w:p>
+      <w:pPr>
+        <w:pStyle w:val="ListParagraph"/>
+        <w:numPr>
+          <w:ilvl w:val="0"/>
+          <w:numId w:val="12"/>
+        </w:numPr>
+      </w:pPr>
+      <w:r>
+        <w:t>Sessions per day: 5</w:t>
+      </w:r>
+    </w:p>
+    <w:p>
+      <w:pPr>
+        <w:pStyle w:val="ListParagraph"/>
+        <w:numPr>
+          <w:ilvl w:val="0"/>
+          <w:numId w:val="12"/>
+        </w:numPr>
+      </w:pPr>
+      <w:r>
+        <w:t xml:space="preserve">Grace period: 15 minutes. </w:t>
+      </w:r>
+    </w:p>
+    <w:p>
+      <w:pPr>
+        <w:pStyle w:val="ListParagraph"/>
+        <w:numPr>
+          <w:ilvl w:val="0"/>
+          <w:numId w:val="12"/>
+        </w:numPr>
+      </w:pPr>
+      <w:r>
+        <w:t xml:space="preserve">ConcludeSessionAfterInactive: 30 minutes. </w:t>
+      </w:r>
+    </w:p>
+    <w:p>
+      <w:r>
+        <w:t xml:space="preserve">Idle Behaviour: The idle behaviour should work like this. The WPM stops tracking if the session has moved into an idle state, The session moves into an idle state only when the user has not been active in the environemnt for a duration longer than 5 minutes. </w:t>
+      </w:r>
+    </w:p>
+    <w:p>
+      <w:r>
+        <w:t xml:space="preserve">Grace Period: If the user has been away longer then the grace period, it closes the current active session segement. If the user returns within the grace period the session restarts as normal. </w:t>
+      </w:r>
+    </w:p>
+    <w:p>
+      <w:r>
+        <w:t xml:space="preserve">ConcludeSessionAfterInactive: 30 minutes has passed and the user has been away, this means the session is concluded and closed out, the written words for that session are registered and the session ends. </w:t>
+      </w:r>
+    </w:p>
+    <w:p/>
+    <w:p>
+      <w:r>
+        <w:br w:type="page"/>
+      </w:r>
+    </w:p>
+    <w:p>
+      <w:pPr>
+        <w:pStyle w:val="Heading2"/>
+      </w:pPr>
+      <w:r>
+        <w:lastRenderedPageBreak/>
+        <w:t xml:space="preserve">9. A co authoring workspace. Like steam for gamers but Steam for authors. </w:t>
+      </w:r>
+    </w:p>
+    <w:p>
+      <w:r>
+        <w:t xml:space="preserve">Users are able to preview, buy, and sell their books on the platform. Because the data saves locally until they publish it is the best platform for this. It keeps everything central. Also several authors can join in on Zoom sessions or writing sessions where the writing tracker reflects not only each authors progress, but the inspiration logged with each vers aswell. </w:t>
+      </w:r>
+    </w:p>
+    <w:p>
+      <w:r>
+        <w:t xml:space="preserve">Something that writers often talk about as getting feedback from an audience is that the feeling they are trying to invoke in the scene, if they pass that feeling to the reader then they have achieved the goal they set out to. This could be useful and make the feedback session funner in the sense that when an author asks the reader to give feedback against a vers, they can better test how well it invoked the feelings they were going for, allowing them to quantify or prove what they were aiming for by a way of measuring the feedback from readers. </w:t>
+      </w:r>
+    </w:p>
+    <w:p>
+      <w:r>
+        <w:t xml:space="preserve">The site could also offer readers an option to leave feedback on sections in the application. Much like they do with steam but on the platform where other readers who haven’t bought the book, can see that feedback. It can act as a direct way in which authors can engage with their readers. Much like developers do with the games they create. </w:t>
+      </w:r>
+    </w:p>
+    <w:p>
+      <w:r>
+        <w:br w:type="page"/>
+      </w:r>
+    </w:p>
+    <w:p>
+      <w:pPr>
         <w:pStyle w:val="Heading2"/>
         <w:numPr>
           <w:ilvl w:val="0"/>
@@ -593,83 +680,157 @@
         </w:numPr>
       </w:pPr>
       <w:r>
-        <w:br w:type="page"/>
-      </w:r>
-    </w:p>
-    <w:p>
-      <w:r>
+        <w:lastRenderedPageBreak/>
+        <w:t>First and second draft revision runs.</w:t>
+      </w:r>
+    </w:p>
+    <w:p>
+      <w:pPr>
+        <w:pStyle w:val="Heading2"/>
+        <w:numPr>
+          <w:ilvl w:val="0"/>
+          <w:numId w:val="2"/>
+        </w:numPr>
+      </w:pPr>
+      <w:r>
+        <w:t>Device Integrations</w:t>
+      </w:r>
+      <w:r>
+        <w:t xml:space="preserve"> </w:t>
+      </w:r>
+    </w:p>
+    <w:p>
+      <w:r>
+        <w:t xml:space="preserve">Users are able to upload or integrate their Remarkable, or other devices into the application by mentioning in their document the line number where they left off. </w:t>
+      </w:r>
+    </w:p>
+    <w:p>
+      <w:r>
+        <w:t xml:space="preserve">There should also be a way that they can sync between devices. This is to improve the cross workability of the application leveraging multiple devices to ensure continuity between devices. The biggest issue I have noticed is that when I Start somewhere there is time that I have to use to connect or copy over the work. This time can be reduced by an integration layer that adds the material that isn’t already on the device to the other device. </w:t>
+      </w:r>
+    </w:p>
+    <w:p/>
+    <w:p>
+      <w:pPr>
+        <w:pStyle w:val="Heading2"/>
+      </w:pPr>
+      <w:r>
+        <w:t>Build Notes</w:t>
+      </w:r>
+    </w:p>
+    <w:p>
+      <w:pPr>
+        <w:pStyle w:val="Heading3"/>
+      </w:pPr>
+      <w:r>
+        <w:t xml:space="preserve">Build RAM consumption and modularity for large scale books. </w:t>
+      </w:r>
+    </w:p>
+    <w:p>
+      <w:r>
+        <w:t xml:space="preserve">Considering this build note, when you look at the current project. How would this app stack up to the issue this </w:t>
+      </w:r>
+      <w:proofErr w:type="spellStart"/>
+      <w:r>
+        <w:t>redit</w:t>
+      </w:r>
+      <w:proofErr w:type="spellEnd"/>
+      <w:r>
+        <w:t xml:space="preserve"> user is discussing. </w:t>
+      </w:r>
+    </w:p>
+    <w:p>
+      <w:pPr>
         <w:rPr>
-          <w:noProof/>
+          <w:i/>
+          <w:iCs/>
         </w:rPr>
-        <w:lastRenderedPageBreak/>
-        <mc:AlternateContent>
-          <mc:Choice Requires="wps">
-            <w:drawing>
-              <wp:inline distT="0" distB="0" distL="0" distR="0" wp14:anchorId="4748A9DA" wp14:editId="7BBC90FD">
-                <wp:extent cx="308610" cy="308610"/>
-                <wp:effectExtent l="0" t="0" r="0" b="0"/>
-                <wp:docPr id="419886461" name="Rectangle 1"/>
-                <wp:cNvGraphicFramePr>
-                  <a:graphicFrameLocks xmlns:a="http://schemas.openxmlformats.org/drawingml/2006/main" noChangeAspect="1"/>
-                </wp:cNvGraphicFramePr>
-                <a:graphic xmlns:a="http://schemas.openxmlformats.org/drawingml/2006/main">
-                  <a:graphicData uri="http://schemas.microsoft.com/office/word/2010/wordprocessingShape">
-                    <wps:wsp>
-                      <wps:cNvSpPr>
-                        <a:spLocks noChangeAspect="1" noChangeArrowheads="1"/>
-                      </wps:cNvSpPr>
-                      <wps:spPr bwMode="auto">
-                        <a:xfrm>
-                          <a:off x="0" y="0"/>
-                          <a:ext cx="308610" cy="308610"/>
-                        </a:xfrm>
-                        <a:prstGeom prst="rect">
-                          <a:avLst/>
-                        </a:prstGeom>
-                        <a:noFill/>
-                        <a:ln>
-                          <a:noFill/>
-                        </a:ln>
-                        <a:extLst>
-                          <a:ext uri="{909E8E84-426E-40DD-AFC4-6F175D3DCCD1}">
-                            <a14:hiddenFill xmlns:a14="http://schemas.microsoft.com/office/drawing/2010/main">
-                              <a:solidFill>
-                                <a:srgbClr val="FFFFFF"/>
-                              </a:solidFill>
-                            </a14:hiddenFill>
-                          </a:ext>
-                          <a:ext uri="{91240B29-F687-4F45-9708-019B960494DF}">
-                            <a14:hiddenLine xmlns:a14="http://schemas.microsoft.com/office/drawing/2010/main" w="9525">
-                              <a:solidFill>
-                                <a:srgbClr val="000000"/>
-                              </a:solidFill>
-                              <a:miter lim="800000"/>
-                              <a:headEnd/>
-                              <a:tailEnd/>
-                            </a14:hiddenLine>
-                          </a:ext>
-                        </a:extLst>
-                      </wps:spPr>
-                      <wps:bodyPr rot="0" vert="horz" wrap="square" lIns="91440" tIns="45720" rIns="91440" bIns="45720" anchor="t" anchorCtr="0" upright="1">
-                        <a:noAutofit/>
-                      </wps:bodyPr>
-                    </wps:wsp>
-                  </a:graphicData>
-                </a:graphic>
-              </wp:inline>
-            </w:drawing>
-          </mc:Choice>
-          <mc:Fallback>
-            <w:pict>
-              <v:rect w14:anchorId="29F805F0" id="Rectangle 1" o:spid="_x0000_s1026" style="width:24.3pt;height:24.3pt;visibility:visible;mso-wrap-style:square;mso-left-percent:-10001;mso-top-percent:-10001;mso-position-horizontal:absolute;mso-position-horizontal-relative:char;mso-position-vertical:absolute;mso-position-vertical-relative:line;mso-left-percent:-10001;mso-top-percent:-10001;v-text-anchor:top" o:gfxdata="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" filled="f" stroked="f">
-                <o:lock v:ext="edit" aspectratio="t"/>
-                <w10:anchorlock/>
-              </v:rect>
-            </w:pict>
-          </mc:Fallback>
-        </mc:AlternateContent>
-      </w:r>
-    </w:p>
+      </w:pPr>
+      <w:r>
+        <w:rPr>
+          <w:i/>
+          <w:iCs/>
+        </w:rPr>
+        <w:t>For fiction novels, it has a few features which really help. Scrivener nicely places all those documents in one 'binder'. Opening just a scene isn't laggy.</w:t>
+      </w:r>
+    </w:p>
+    <w:p>
+      <w:pPr>
+        <w:rPr>
+          <w:i/>
+          <w:iCs/>
+        </w:rPr>
+      </w:pPr>
+      <w:r>
+        <w:rPr>
+          <w:i/>
+          <w:iCs/>
+        </w:rPr>
+        <w:t>I wrote my first novel in word. To reduce lag, each chapter was a separate document. Moving scenes among chapters was hard. Checking the flow between chapters was hard. Frequently, I'd have several chapters open and then word would get laggy since my computer isn't so new/fast. Getting all the chapters together so I could read through a draft was a beast.</w:t>
+      </w:r>
+    </w:p>
+    <w:p>
+      <w:pPr>
+        <w:rPr>
+          <w:i/>
+          <w:iCs/>
+        </w:rPr>
+      </w:pPr>
+      <w:r>
+        <w:rPr>
+          <w:i/>
+          <w:iCs/>
+        </w:rPr>
+        <w:t>I copied and pasted all the Chapters into Scrivener and everything ran faster, I could quickly toggle between scenes, and with a click I could have a PDF/RTF/Mobi file of the entire thing for review.</w:t>
+      </w:r>
+    </w:p>
+    <w:p>
+      <w:pPr>
+        <w:rPr>
+          <w:i/>
+          <w:iCs/>
+        </w:rPr>
+      </w:pPr>
+      <w:r>
+        <w:rPr>
+          <w:i/>
+          <w:iCs/>
+        </w:rPr>
+        <w:t xml:space="preserve">For drafting, I switch to composition mode. I get a blank white screen with no toolbars or rulers. Just my text. This is by far my </w:t>
+      </w:r>
+      <w:proofErr w:type="spellStart"/>
+      <w:r>
+        <w:rPr>
+          <w:i/>
+          <w:iCs/>
+        </w:rPr>
+        <w:t>favorite</w:t>
+      </w:r>
+      <w:proofErr w:type="spellEnd"/>
+      <w:r>
+        <w:rPr>
+          <w:i/>
+          <w:iCs/>
+        </w:rPr>
+        <w:t xml:space="preserve"> UI for writing.</w:t>
+      </w:r>
+    </w:p>
+    <w:p>
+      <w:pPr>
+        <w:rPr>
+          <w:i/>
+          <w:iCs/>
+        </w:rPr>
+      </w:pPr>
+      <w:r>
+        <w:rPr>
+          <w:i/>
+          <w:iCs/>
+        </w:rPr>
+        <w:t>I think that's the major buzz. It's a program that gets a few features really right for writers.</w:t>
+      </w:r>
+    </w:p>
+    <w:p/>
     <w:sectPr>
       <w:pgSz w:w="11906" w:h="16838"/>
       <w:pgMar w:top="1440" w:right="1440" w:bottom="1440" w:left="1440" w:header="708" w:footer="708" w:gutter="0"/>
@@ -1395,6 +1556,119 @@
     </w:lvl>
   </w:abstractNum>
   <w:abstractNum w:abstractNumId="8" w15:restartNumberingAfterBreak="0">
+    <w:nsid w:val="305C055D"/>
+    <w:multiLevelType w:val="hybridMultilevel"/>
+    <w:tmpl w:val="FBFED6B0"/>
+    <w:lvl w:ilvl="0" w:tplc="0C090001">
+      <w:start w:val="1"/>
+      <w:numFmt w:val="bullet"/>
+      <w:lvlText w:val=""/>
+      <w:lvlJc w:val="left"/>
+      <w:pPr>
+        <w:ind w:left="720" w:hanging="360"/>
+      </w:pPr>
+      <w:rPr>
+        <w:rFonts w:ascii="Symbol" w:hAnsi="Symbol" w:hint="default"/>
+      </w:rPr>
+    </w:lvl>
+    <w:lvl w:ilvl="1" w:tplc="0C090003" w:tentative="1">
+      <w:start w:val="1"/>
+      <w:numFmt w:val="bullet"/>
+      <w:lvlText w:val="o"/>
+      <w:lvlJc w:val="left"/>
+      <w:pPr>
+        <w:ind w:left="1440" w:hanging="360"/>
+      </w:pPr>
+      <w:rPr>
+        <w:rFonts w:ascii="Courier New" w:hAnsi="Courier New" w:cs="Courier New" w:hint="default"/>
+      </w:rPr>
+    </w:lvl>
+    <w:lvl w:ilvl="2" w:tplc="0C090005" w:tentative="1">
+      <w:start w:val="1"/>
+      <w:numFmt w:val="bullet"/>
+      <w:lvlText w:val=""/>
+      <w:lvlJc w:val="left"/>
+      <w:pPr>
+        <w:ind w:left="2160" w:hanging="360"/>
+      </w:pPr>
+      <w:rPr>
+        <w:rFonts w:ascii="Wingdings" w:hAnsi="Wingdings" w:hint="default"/>
+      </w:rPr>
+    </w:lvl>
+    <w:lvl w:ilvl="3" w:tplc="0C090001" w:tentative="1">
+      <w:start w:val="1"/>
+      <w:numFmt w:val="bullet"/>
+      <w:lvlText w:val=""/>
+      <w:lvlJc w:val="left"/>
+      <w:pPr>
+        <w:ind w:left="2880" w:hanging="360"/>
+      </w:pPr>
+      <w:rPr>
+        <w:rFonts w:ascii="Symbol" w:hAnsi="Symbol" w:hint="default"/>
+      </w:rPr>
+    </w:lvl>
+    <w:lvl w:ilvl="4" w:tplc="0C090003" w:tentative="1">
+      <w:start w:val="1"/>
+      <w:numFmt w:val="bullet"/>
+      <w:lvlText w:val="o"/>
+      <w:lvlJc w:val="left"/>
+      <w:pPr>
+        <w:ind w:left="3600" w:hanging="360"/>
+      </w:pPr>
+      <w:rPr>
+        <w:rFonts w:ascii="Courier New" w:hAnsi="Courier New" w:cs="Courier New" w:hint="default"/>
+      </w:rPr>
+    </w:lvl>
+    <w:lvl w:ilvl="5" w:tplc="0C090005" w:tentative="1">
+      <w:start w:val="1"/>
+      <w:numFmt w:val="bullet"/>
+      <w:lvlText w:val=""/>
+      <w:lvlJc w:val="left"/>
+      <w:pPr>
+        <w:ind w:left="4320" w:hanging="360"/>
+      </w:pPr>
+      <w:rPr>
+        <w:rFonts w:ascii="Wingdings" w:hAnsi="Wingdings" w:hint="default"/>
+      </w:rPr>
+    </w:lvl>
+    <w:lvl w:ilvl="6" w:tplc="0C090001" w:tentative="1">
+      <w:start w:val="1"/>
+      <w:numFmt w:val="bullet"/>
+      <w:lvlText w:val=""/>
+      <w:lvlJc w:val="left"/>
+      <w:pPr>
+        <w:ind w:left="5040" w:hanging="360"/>
+      </w:pPr>
+      <w:rPr>
+        <w:rFonts w:ascii="Symbol" w:hAnsi="Symbol" w:hint="default"/>
+      </w:rPr>
+    </w:lvl>
+    <w:lvl w:ilvl="7" w:tplc="0C090003" w:tentative="1">
+      <w:start w:val="1"/>
+      <w:numFmt w:val="bullet"/>
+      <w:lvlText w:val="o"/>
+      <w:lvlJc w:val="left"/>
+      <w:pPr>
+        <w:ind w:left="5760" w:hanging="360"/>
+      </w:pPr>
+      <w:rPr>
+        <w:rFonts w:ascii="Courier New" w:hAnsi="Courier New" w:cs="Courier New" w:hint="default"/>
+      </w:rPr>
+    </w:lvl>
+    <w:lvl w:ilvl="8" w:tplc="0C090005" w:tentative="1">
+      <w:start w:val="1"/>
+      <w:numFmt w:val="bullet"/>
+      <w:lvlText w:val=""/>
+      <w:lvlJc w:val="left"/>
+      <w:pPr>
+        <w:ind w:left="6480" w:hanging="360"/>
+      </w:pPr>
+      <w:rPr>
+        <w:rFonts w:ascii="Wingdings" w:hAnsi="Wingdings" w:hint="default"/>
+      </w:rPr>
+    </w:lvl>
+  </w:abstractNum>
+  <w:abstractNum w:abstractNumId="9" w15:restartNumberingAfterBreak="0">
     <w:nsid w:val="468A6001"/>
     <w:multiLevelType w:val="hybridMultilevel"/>
     <w:tmpl w:val="B3066E1E"/>
@@ -1483,7 +1757,7 @@
       </w:pPr>
     </w:lvl>
   </w:abstractNum>
-  <w:abstractNum w:abstractNumId="9" w15:restartNumberingAfterBreak="0">
+  <w:abstractNum w:abstractNumId="10" w15:restartNumberingAfterBreak="0">
     <w:nsid w:val="481D3DBD"/>
     <w:multiLevelType w:val="hybridMultilevel"/>
     <w:tmpl w:val="B4026956"/>
@@ -1572,7 +1846,7 @@
       </w:pPr>
     </w:lvl>
   </w:abstractNum>
-  <w:abstractNum w:abstractNumId="10" w15:restartNumberingAfterBreak="0">
+  <w:abstractNum w:abstractNumId="11" w15:restartNumberingAfterBreak="0">
     <w:nsid w:val="61066A59"/>
     <w:multiLevelType w:val="hybridMultilevel"/>
     <w:tmpl w:val="B4026956"/>
@@ -1665,7 +1939,7 @@
     <w:abstractNumId w:val="0"/>
   </w:num>
   <w:num w:numId="2" w16cid:durableId="1948999721">
-    <w:abstractNumId w:val="9"/>
+    <w:abstractNumId w:val="10"/>
   </w:num>
   <w:num w:numId="3" w16cid:durableId="2005737691">
     <w:abstractNumId w:val="3"/>
@@ -1674,7 +1948,7 @@
     <w:abstractNumId w:val="6"/>
   </w:num>
   <w:num w:numId="5" w16cid:durableId="637029386">
-    <w:abstractNumId w:val="10"/>
+    <w:abstractNumId w:val="11"/>
   </w:num>
   <w:num w:numId="6" w16cid:durableId="2105107860">
     <w:abstractNumId w:val="4"/>
@@ -1692,6 +1966,9 @@
     <w:abstractNumId w:val="5"/>
   </w:num>
   <w:num w:numId="11" w16cid:durableId="804398041">
+    <w:abstractNumId w:val="9"/>
+  </w:num>
+  <w:num w:numId="12" w16cid:durableId="1201432617">
     <w:abstractNumId w:val="8"/>
   </w:num>
 </w:numbering>
@@ -2298,7 +2575,6 @@
   <w:style w:type="character" w:default="1" w:styleId="DefaultParagraphFont">
     <w:name w:val="Default Paragraph Font"/>
     <w:uiPriority w:val="1"/>
-    <w:semiHidden/>
     <w:unhideWhenUsed/>
   </w:style>
   <w:style w:type="table" w:default="1" w:styleId="TableNormal">

</xml_diff>